<commit_message>
fix(cli): harden friend install paths
</commit_message>
<xml_diff>
--- a/docs/friend/word/Lodestone-Feature-Brochure.docx
+++ b/docs/friend/word/Lodestone-Feature-Brochure.docx
@@ -1364,13 +1364,13 @@
         <w:t xml:space="preserve"> </w:t>
       </w:r>
       <w:r>
-        <w:t xml:space="preserve">operation, migration automation, and heavier enterprise orchestration are later</w:t>
+        <w:t xml:space="preserve">operation, migration automation, and heavier enterprise orchestration are v0.5+</w:t>
       </w:r>
       <w:r>
         <w:t xml:space="preserve"> </w:t>
       </w:r>
       <w:r>
-        <w:t xml:space="preserve">work.</w:t>
+        <w:t xml:space="preserve">or later work.</w:t>
       </w:r>
     </w:p>
     <w:bookmarkEnd w:id="39"/>

</xml_diff>

<commit_message>
release(friend-install): prepare v0.1.6 codex adapter
</commit_message>
<xml_diff>
--- a/docs/friend/word/Lodestone-Feature-Brochure.docx
+++ b/docs/friend/word/Lodestone-Feature-Brochure.docx
@@ -2,7 +2,7 @@
 <file path=word/document.xml><?xml version="1.0" encoding="utf-8"?>
 <w:document xmlns:w="http://schemas.openxmlformats.org/wordprocessingml/2006/main" xmlns:m="http://schemas.openxmlformats.org/officeDocument/2006/math" xmlns:r="http://schemas.openxmlformats.org/officeDocument/2006/relationships" xmlns:o="urn:schemas-microsoft-com:office:office" xmlns:v="urn:schemas-microsoft-com:vml" xmlns:w10="urn:schemas-microsoft-com:office:word" xmlns:a="http://schemas.openxmlformats.org/drawingml/2006/main" xmlns:pic="http://schemas.openxmlformats.org/drawingml/2006/picture" xmlns:wp="http://schemas.openxmlformats.org/drawingml/2006/wordprocessingDrawing">
   <w:body>
-    <w:bookmarkStart w:id="44" w:name="lodestone"/>
+    <w:bookmarkStart w:id="45" w:name="lodestone"/>
     <w:p>
       <w:pPr>
         <w:pStyle w:val="Heading1"/>
@@ -38,7 +38,7 @@
         <w:t xml:space="preserve">Cybersecurity Management &amp; Network Defense, Inc.</w:t>
       </w:r>
       <w:r>
-        <w:br/>
+        <w:t xml:space="preserve"> </w:t>
       </w:r>
       <w:r>
         <w:rPr>
@@ -54,7 +54,7 @@
         <w:t xml:space="preserve">Feature brochure</w:t>
       </w:r>
       <w:r>
-        <w:br/>
+        <w:t xml:space="preserve"> </w:t>
       </w:r>
       <w:r>
         <w:rPr>
@@ -67,10 +67,10 @@
         <w:t xml:space="preserve"> </w:t>
       </w:r>
       <w:r>
-        <w:t xml:space="preserve">v0.1.5 friend-install documentation</w:t>
-      </w:r>
-      <w:r>
-        <w:br/>
+        <w:t xml:space="preserve">v0.1.6 friend-install documentation</w:t>
+      </w:r>
+      <w:r>
+        <w:t xml:space="preserve"> </w:t>
       </w:r>
       <w:r>
         <w:rPr>
@@ -368,7 +368,7 @@
       </w:r>
     </w:p>
     <w:bookmarkEnd w:id="22"/>
-    <w:bookmarkStart w:id="33" w:name="full-feature-set"/>
+    <w:bookmarkStart w:id="34" w:name="full-feature-set"/>
     <w:p>
       <w:pPr>
         <w:pStyle w:val="Heading2"/>
@@ -923,8 +923,83 @@
       </w:r>
     </w:p>
     <w:bookmarkEnd w:id="32"/>
+    <w:bookmarkStart w:id="33" w:name="optional-codex-adapter"/>
+    <w:p>
+      <w:pPr>
+        <w:pStyle w:val="Heading3"/>
+      </w:pPr>
+      <w:r>
+        <w:t xml:space="preserve">Optional Codex adapter</w:t>
+      </w:r>
+    </w:p>
+    <w:p>
+      <w:pPr>
+        <w:pStyle w:val="FirstParagraph"/>
+      </w:pPr>
+      <w:r>
+        <w:t xml:space="preserve">Lodestone can write project-local Codex MCP configuration during install. A</w:t>
+      </w:r>
+      <w:r>
+        <w:t xml:space="preserve"> </w:t>
+      </w:r>
+      <w:r>
+        <w:t xml:space="preserve">Codex user adds</w:t>
+      </w:r>
+      <w:r>
+        <w:t xml:space="preserve"> </w:t>
+      </w:r>
+      <w:r>
+        <w:rPr>
+          <w:rStyle w:val="VerbatimChar"/>
+        </w:rPr>
+        <w:t xml:space="preserve">LODESTONE_CLIENT=codex</w:t>
+      </w:r>
+      <w:r>
+        <w:t xml:space="preserve"> </w:t>
+      </w:r>
+      <w:r>
+        <w:t xml:space="preserve">to the installer command, then verifies</w:t>
+      </w:r>
+      <w:r>
+        <w:t xml:space="preserve"> </w:t>
+      </w:r>
+      <w:r>
+        <w:t xml:space="preserve">with</w:t>
+      </w:r>
+      <w:r>
+        <w:t xml:space="preserve"> </w:t>
+      </w:r>
+      <w:r>
+        <w:rPr>
+          <w:rStyle w:val="VerbatimChar"/>
+        </w:rPr>
+        <w:t xml:space="preserve">lodestone doctor --client codex</w:t>
+      </w:r>
+      <w:r>
+        <w:t xml:space="preserve">. Codex still decides whether the project</w:t>
+      </w:r>
+      <w:r>
+        <w:t xml:space="preserve"> </w:t>
+      </w:r>
+      <w:r>
+        <w:t xml:space="preserve">is trusted before loading</w:t>
+      </w:r>
+      <w:r>
+        <w:t xml:space="preserve"> </w:t>
+      </w:r>
+      <w:r>
+        <w:rPr>
+          <w:rStyle w:val="VerbatimChar"/>
+        </w:rPr>
+        <w:t xml:space="preserve">.codex/config.toml</w:t>
+      </w:r>
+      <w:r>
+        <w:t xml:space="preserve">.</w:t>
+      </w:r>
+    </w:p>
     <w:bookmarkEnd w:id="33"/>
-    <w:bookmarkStart w:id="34" w:name="X1f8fcd8b274c14c4250247918ae44b396ada634"/>
+    <w:bookmarkEnd w:id="34"/>
+    <w:bookmarkStart w:id="35" w:name="X1f8fcd8b274c14c4250247918ae44b396ada634"/>
     <w:p>
       <w:pPr>
         <w:pStyle w:val="Heading2"/>
@@ -1208,8 +1283,8 @@
         </w:tc>
       </w:tr>
     </w:tbl>
-    <w:bookmarkEnd w:id="34"/>
-    <w:bookmarkStart w:id="40" w:name="design-principles"/>
+    <w:bookmarkEnd w:id="35"/>
+    <w:bookmarkStart w:id="41" w:name="design-principles"/>
     <w:p>
       <w:pPr>
         <w:pStyle w:val="Heading2"/>
@@ -1218,7 +1293,7 @@
         <w:t xml:space="preserve">Design Principles</w:t>
       </w:r>
     </w:p>
-    <w:bookmarkStart w:id="35" w:name="local-first"/>
+    <w:bookmarkStart w:id="36" w:name="local-first"/>
     <w:p>
       <w:pPr>
         <w:pStyle w:val="Heading3"/>
@@ -1241,8 +1316,8 @@
         <w:t xml:space="preserve">project, not a remote service that owns the project context.</w:t>
       </w:r>
     </w:p>
-    <w:bookmarkEnd w:id="35"/>
-    <w:bookmarkStart w:id="36" w:name="agent-native"/>
+    <w:bookmarkEnd w:id="36"/>
+    <w:bookmarkStart w:id="37" w:name="agent-native"/>
     <w:p>
       <w:pPr>
         <w:pStyle w:val="Heading3"/>
@@ -1262,11 +1337,38 @@
         <w:t xml:space="preserve"> </w:t>
       </w:r>
       <w:r>
-        <w:t xml:space="preserve">MCP tools. The user should not have to copy and paste large context packets.</w:t>
+        <w:t xml:space="preserve">MCP tools. The default</w:t>
+      </w:r>
+      <w:r>
+        <w:t xml:space="preserve"> </w:t>
+      </w:r>
+      <w:r>
+        <w:rPr>
+          <w:rStyle w:val="VerbatimChar"/>
+        </w:rPr>
+        <w:t xml:space="preserve">.mcp.json</w:t>
+      </w:r>
+      <w:r>
+        <w:t xml:space="preserve"> </w:t>
+      </w:r>
+      <w:r>
+        <w:t xml:space="preserve">path works for common MCP-aware editors, and</w:t>
+      </w:r>
+      <w:r>
+        <w:t xml:space="preserve"> </w:t>
+      </w:r>
+      <w:r>
+        <w:t xml:space="preserve">the optional Codex adapter writes Codex's project-local MCP config. The user</w:t>
+      </w:r>
+      <w:r>
+        <w:t xml:space="preserve"> </w:t>
+      </w:r>
+      <w:r>
+        <w:t xml:space="preserve">should not have to copy and paste large context packets.</w:t>
       </w:r>
     </w:p>
-    <w:bookmarkEnd w:id="36"/>
-    <w:bookmarkStart w:id="37" w:name="beginner-friendly"/>
+    <w:bookmarkEnd w:id="37"/>
+    <w:bookmarkStart w:id="38" w:name="beginner-friendly"/>
     <w:p>
       <w:pPr>
         <w:pStyle w:val="Heading3"/>
@@ -1304,8 +1406,8 @@
         <w:t xml:space="preserve">and the first recommended question is obvious.</w:t>
       </w:r>
     </w:p>
-    <w:bookmarkEnd w:id="37"/>
-    <w:bookmarkStart w:id="38" w:name="power-user-capable"/>
+    <w:bookmarkEnd w:id="38"/>
+    <w:bookmarkStart w:id="39" w:name="power-user-capable"/>
     <w:p>
       <w:pPr>
         <w:pStyle w:val="Heading3"/>
@@ -1343,8 +1445,8 @@
         <w:t xml:space="preserve">SQLite database, and operate Lodestone from the CLI.</w:t>
       </w:r>
     </w:p>
-    <w:bookmarkEnd w:id="38"/>
-    <w:bookmarkStart w:id="39" w:name="honest-about-limits"/>
+    <w:bookmarkEnd w:id="39"/>
+    <w:bookmarkStart w:id="40" w:name="honest-about-limits"/>
     <w:p>
       <w:pPr>
         <w:pStyle w:val="Heading3"/>
@@ -1373,9 +1475,9 @@
         <w:t xml:space="preserve">or later work.</w:t>
       </w:r>
     </w:p>
-    <w:bookmarkEnd w:id="39"/>
     <w:bookmarkEnd w:id="40"/>
-    <w:bookmarkStart w:id="41" w:name="who-should-use-it"/>
+    <w:bookmarkEnd w:id="41"/>
+    <w:bookmarkStart w:id="42" w:name="who-should-use-it"/>
     <w:p>
       <w:pPr>
         <w:pStyle w:val="Heading2"/>
@@ -1452,8 +1554,8 @@
         <w:t xml:space="preserve">A CMNDI operator dogfooding agentic coding workflows.</w:t>
       </w:r>
     </w:p>
-    <w:bookmarkEnd w:id="41"/>
-    <w:bookmarkStart w:id="42" w:name="what-success-looks-like"/>
+    <w:bookmarkEnd w:id="42"/>
+    <w:bookmarkStart w:id="43" w:name="what-success-looks-like"/>
     <w:p>
       <w:pPr>
         <w:pStyle w:val="Heading2"/>
@@ -1507,8 +1609,8 @@
         <w:t xml:space="preserve">what depends on a file, or what changed on the branch.</w:t>
       </w:r>
     </w:p>
-    <w:bookmarkEnd w:id="42"/>
-    <w:bookmarkStart w:id="43" w:name="one-sentence"/>
+    <w:bookmarkEnd w:id="43"/>
+    <w:bookmarkStart w:id="44" w:name="one-sentence"/>
     <w:p>
       <w:pPr>
         <w:pStyle w:val="Heading2"/>
@@ -1531,8 +1633,8 @@
         <w:t xml:space="preserve">the repository before it starts editing.</w:t>
       </w:r>
     </w:p>
-    <w:bookmarkEnd w:id="43"/>
     <w:bookmarkEnd w:id="44"/>
+    <w:bookmarkEnd w:id="45"/>
     <w:sectPr>
       <w:headerReference r:id="rId9" w:type="default"/>
       <w:footerReference r:id="rId10" w:type="default"/>

</xml_diff>

<commit_message>
docs: clarify friend install profiles and pro temporal kg boundary
</commit_message>
<xml_diff>
--- a/docs/friend/word/Lodestone-Feature-Brochure.docx
+++ b/docs/friend/word/Lodestone-Feature-Brochure.docx
@@ -83,7 +83,7 @@
         <w:t xml:space="preserve"> </w:t>
       </w:r>
       <w:r>
-        <w:t xml:space="preserve">June 8, 2026</w:t>
+        <w:t xml:space="preserve">June 9, 2026</w:t>
       </w:r>
     </w:p>
     <w:bookmarkEnd w:id="19"/>
@@ -559,7 +559,13 @@
         <w:t xml:space="preserve"> </w:t>
       </w:r>
       <w:r>
-        <w:t xml:space="preserve">blindly scanning the repo or relying on a human to summarize the branch.</w:t>
+        <w:t xml:space="preserve">blindly scanning the repo or relying on a human to summarize the branch. This</w:t>
+      </w:r>
+      <w:r>
+        <w:t xml:space="preserve"> </w:t>
+      </w:r>
+      <w:r>
+        <w:t xml:space="preserve">is git-aware current-index context, not a historical temporal graph.</w:t>
       </w:r>
     </w:p>
     <w:bookmarkEnd w:id="27"/>
@@ -1466,13 +1472,13 @@
         <w:t xml:space="preserve"> </w:t>
       </w:r>
       <w:r>
-        <w:t xml:space="preserve">operation, migration automation, and heavier enterprise orchestration are v0.5+</w:t>
+        <w:t xml:space="preserve">operation, temporal KG history, migration automation, and heavier enterprise</w:t>
       </w:r>
       <w:r>
         <w:t xml:space="preserve"> </w:t>
       </w:r>
       <w:r>
-        <w:t xml:space="preserve">or later work.</w:t>
+        <w:t xml:space="preserve">orchestration are v0.5+ or later work.</w:t>
       </w:r>
     </w:p>
     <w:bookmarkEnd w:id="40"/>

</xml_diff>

<commit_message>
Clarify friend install profiles and Pro temporal KG boundary (#6)
* docs: clarify friend install profiles and pro temporal kg boundary

* chore(docs): refresh CMNDI index metadata
</commit_message>
<xml_diff>
--- a/docs/friend/word/Lodestone-Feature-Brochure.docx
+++ b/docs/friend/word/Lodestone-Feature-Brochure.docx
@@ -83,7 +83,7 @@
         <w:t xml:space="preserve"> </w:t>
       </w:r>
       <w:r>
-        <w:t xml:space="preserve">June 8, 2026</w:t>
+        <w:t xml:space="preserve">June 9, 2026</w:t>
       </w:r>
     </w:p>
     <w:bookmarkEnd w:id="19"/>
@@ -559,7 +559,13 @@
         <w:t xml:space="preserve"> </w:t>
       </w:r>
       <w:r>
-        <w:t xml:space="preserve">blindly scanning the repo or relying on a human to summarize the branch.</w:t>
+        <w:t xml:space="preserve">blindly scanning the repo or relying on a human to summarize the branch. This</w:t>
+      </w:r>
+      <w:r>
+        <w:t xml:space="preserve"> </w:t>
+      </w:r>
+      <w:r>
+        <w:t xml:space="preserve">is git-aware current-index context, not a historical temporal graph.</w:t>
       </w:r>
     </w:p>
     <w:bookmarkEnd w:id="27"/>
@@ -1466,13 +1472,13 @@
         <w:t xml:space="preserve"> </w:t>
       </w:r>
       <w:r>
-        <w:t xml:space="preserve">operation, migration automation, and heavier enterprise orchestration are v0.5+</w:t>
+        <w:t xml:space="preserve">operation, temporal KG history, migration automation, and heavier enterprise</w:t>
       </w:r>
       <w:r>
         <w:t xml:space="preserve"> </w:t>
       </w:r>
       <w:r>
-        <w:t xml:space="preserve">or later work.</w:t>
+        <w:t xml:space="preserve">orchestration are v0.5+ or later work.</w:t>
       </w:r>
     </w:p>
     <w:bookmarkEnd w:id="40"/>

</xml_diff>

<commit_message>
fix(cli): make uninstall help non-destructive
</commit_message>
<xml_diff>
--- a/docs/friend/word/Lodestone-Feature-Brochure.docx
+++ b/docs/friend/word/Lodestone-Feature-Brochure.docx
@@ -67,7 +67,7 @@
         <w:t xml:space="preserve"> </w:t>
       </w:r>
       <w:r>
-        <w:t xml:space="preserve">v0.1.7 friend-install documentation</w:t>
+        <w:t xml:space="preserve">v0.1.8 friend-install documentation</w:t>
       </w:r>
       <w:r>
         <w:t xml:space="preserve"> </w:t>
@@ -83,7 +83,7 @@
         <w:t xml:space="preserve"> </w:t>
       </w:r>
       <w:r>
-        <w:t xml:space="preserve">June 9, 2026</w:t>
+        <w:t xml:space="preserve">June 11, 2026</w:t>
       </w:r>
     </w:p>
     <w:bookmarkEnd w:id="19"/>

</xml_diff>

<commit_message>
Fix non-destructive uninstall help and prepare v0.1.8
Merged release fix for v0.1.8 friend distribution: uninstall help is non-destructive, release docs/checksums updated, local and CI gates passed.
</commit_message>
<xml_diff>
--- a/docs/friend/word/Lodestone-Feature-Brochure.docx
+++ b/docs/friend/word/Lodestone-Feature-Brochure.docx
@@ -67,7 +67,7 @@
         <w:t xml:space="preserve"> </w:t>
       </w:r>
       <w:r>
-        <w:t xml:space="preserve">v0.1.7 friend-install documentation</w:t>
+        <w:t xml:space="preserve">v0.1.8 friend-install documentation</w:t>
       </w:r>
       <w:r>
         <w:t xml:space="preserve"> </w:t>
@@ -83,7 +83,7 @@
         <w:t xml:space="preserve"> </w:t>
       </w:r>
       <w:r>
-        <w:t xml:space="preserve">June 9, 2026</w:t>
+        <w:t xml:space="preserve">June 11, 2026</w:t>
       </w:r>
     </w:p>
     <w:bookmarkEnd w:id="19"/>

</xml_diff>

<commit_message>
finish lodestone closeout helper and provenance
</commit_message>
<xml_diff>
--- a/docs/friend/word/Lodestone-Feature-Brochure.docx
+++ b/docs/friend/word/Lodestone-Feature-Brochure.docx
@@ -1000,7 +1000,34 @@
         <w:t xml:space="preserve">.codex/config.toml</w:t>
       </w:r>
       <w:r>
-        <w:t xml:space="preserve">.</w:t>
+        <w:t xml:space="preserve">. If support needs a reproducible</w:t>
+      </w:r>
+      <w:r>
+        <w:t xml:space="preserve"> </w:t>
+      </w:r>
+      <w:r>
+        <w:t xml:space="preserve">Codex check,</w:t>
+      </w:r>
+      <w:r>
+        <w:t xml:space="preserve"> </w:t>
+      </w:r>
+      <w:r>
+        <w:rPr>
+          <w:rStyle w:val="VerbatimChar"/>
+        </w:rPr>
+        <w:t xml:space="preserve">lodestone client-smoke --client codex</w:t>
+      </w:r>
+      <w:r>
+        <w:t xml:space="preserve"> </w:t>
+      </w:r>
+      <w:r>
+        <w:t xml:space="preserve">validates the generated</w:t>
+      </w:r>
+      <w:r>
+        <w:t xml:space="preserve"> </w:t>
+      </w:r>
+      <w:r>
+        <w:t xml:space="preserve">config and local MCP launcher, then prints exact Codex smoke commands.</w:t>
       </w:r>
     </w:p>
     <w:bookmarkEnd w:id="33"/>

</xml_diff>

<commit_message>
feat: add generic MCP client smoke
</commit_message>
<xml_diff>
--- a/docs/friend/word/Lodestone-Feature-Brochure.docx
+++ b/docs/friend/word/Lodestone-Feature-Brochure.docx
@@ -1028,6 +1028,39 @@
       </w:r>
       <w:r>
         <w:t xml:space="preserve">config and local MCP launcher, then prints exact Codex smoke commands.</w:t>
+      </w:r>
+      <w:r>
+        <w:t xml:space="preserve"> </w:t>
+      </w:r>
+      <w:r>
+        <w:t xml:space="preserve">For generic MCP support,</w:t>
+      </w:r>
+      <w:r>
+        <w:t xml:space="preserve"> </w:t>
+      </w:r>
+      <w:r>
+        <w:rPr>
+          <w:rStyle w:val="VerbatimChar"/>
+        </w:rPr>
+        <w:t xml:space="preserve">lodestone client-smoke --client mcp</w:t>
+      </w:r>
+      <w:r>
+        <w:t xml:space="preserve"> </w:t>
+      </w:r>
+      <w:r>
+        <w:t xml:space="preserve">launches the</w:t>
+      </w:r>
+      <w:r>
+        <w:t xml:space="preserve"> </w:t>
+      </w:r>
+      <w:r>
+        <w:t xml:space="preserve">repo-local Lodestone server over stdio and verifies that it returns a tool list,</w:t>
+      </w:r>
+      <w:r>
+        <w:t xml:space="preserve"> </w:t>
+      </w:r>
+      <w:r>
+        <w:t xml:space="preserve">without claiming any specific editor has loaded the config.</w:t>
       </w:r>
     </w:p>
     <w:bookmarkEnd w:id="33"/>

</xml_diff>

<commit_message>
feat: add generic MCP client smoke (#22)
</commit_message>
<xml_diff>
--- a/docs/friend/word/Lodestone-Feature-Brochure.docx
+++ b/docs/friend/word/Lodestone-Feature-Brochure.docx
@@ -1028,6 +1028,39 @@
       </w:r>
       <w:r>
         <w:t xml:space="preserve">config and local MCP launcher, then prints exact Codex smoke commands.</w:t>
+      </w:r>
+      <w:r>
+        <w:t xml:space="preserve"> </w:t>
+      </w:r>
+      <w:r>
+        <w:t xml:space="preserve">For generic MCP support,</w:t>
+      </w:r>
+      <w:r>
+        <w:t xml:space="preserve"> </w:t>
+      </w:r>
+      <w:r>
+        <w:rPr>
+          <w:rStyle w:val="VerbatimChar"/>
+        </w:rPr>
+        <w:t xml:space="preserve">lodestone client-smoke --client mcp</w:t>
+      </w:r>
+      <w:r>
+        <w:t xml:space="preserve"> </w:t>
+      </w:r>
+      <w:r>
+        <w:t xml:space="preserve">launches the</w:t>
+      </w:r>
+      <w:r>
+        <w:t xml:space="preserve"> </w:t>
+      </w:r>
+      <w:r>
+        <w:t xml:space="preserve">repo-local Lodestone server over stdio and verifies that it returns a tool list,</w:t>
+      </w:r>
+      <w:r>
+        <w:t xml:space="preserve"> </w:t>
+      </w:r>
+      <w:r>
+        <w:t xml:space="preserve">without claiming any specific editor has loaded the config.</w:t>
       </w:r>
     </w:p>
     <w:bookmarkEnd w:id="33"/>

</xml_diff>